<commit_message>
added Persistence ipynb file
</commit_message>
<xml_diff>
--- a/Langgraph_introduction.docx
+++ b/Langgraph_introduction.docx
@@ -11,6 +11,7 @@
           <w:szCs w:val="40"/>
         </w:rPr>
       </w:pPr>
+      <w:proofErr w:type="spellStart"/>
       <w:r>
         <w:rPr>
           <w:b/>
@@ -20,6 +21,7 @@
         </w:rPr>
         <w:t>Langgraph</w:t>
       </w:r>
+      <w:proofErr w:type="spellEnd"/>
     </w:p>
     <w:p>
       <w:pPr>
@@ -33,12 +35,33 @@
           <w:sz w:val="40"/>
           <w:szCs w:val="40"/>
         </w:rPr>
-        <w:t>What is Langgraph”</w:t>
-      </w:r>
-    </w:p>
-    <w:p>
-      <w:r>
-        <w:t xml:space="preserve">Langgraph is an orchestration framework for building </w:t>
+        <w:t xml:space="preserve">What is </w:t>
+      </w:r>
+      <w:proofErr w:type="spellStart"/>
+      <w:r>
+        <w:rPr>
+          <w:sz w:val="40"/>
+          <w:szCs w:val="40"/>
+        </w:rPr>
+        <w:t>Langgraph</w:t>
+      </w:r>
+      <w:proofErr w:type="spellEnd"/>
+      <w:r>
+        <w:rPr>
+          <w:sz w:val="40"/>
+          <w:szCs w:val="40"/>
+        </w:rPr>
+        <w:t>”</w:t>
+      </w:r>
+    </w:p>
+    <w:p>
+      <w:proofErr w:type="spellStart"/>
+      <w:r>
+        <w:t>Langgraph</w:t>
+      </w:r>
+      <w:proofErr w:type="spellEnd"/>
+      <w:r>
+        <w:t xml:space="preserve"> is an orchestration framework for building </w:t>
       </w:r>
       <w:r>
         <w:rPr>
@@ -59,7 +82,15 @@
           <w:b/>
           <w:bCs/>
         </w:rPr>
-        <w:t>and mult</w:t>
+        <w:t xml:space="preserve">and </w:t>
+      </w:r>
+      <w:proofErr w:type="spellStart"/>
+      <w:r>
+        <w:rPr>
+          <w:b/>
+          <w:bCs/>
+        </w:rPr>
+        <w:t>mult</w:t>
       </w:r>
       <w:r>
         <w:rPr>
@@ -73,7 +104,15 @@
           <w:b/>
           <w:bCs/>
         </w:rPr>
-        <w:t xml:space="preserve"> step </w:t>
+        <w:t xml:space="preserve"> step</w:t>
+      </w:r>
+      <w:proofErr w:type="spellEnd"/>
+      <w:r>
+        <w:rPr>
+          <w:b/>
+          <w:bCs/>
+        </w:rPr>
+        <w:t xml:space="preserve"> </w:t>
       </w:r>
       <w:r>
         <w:t>LLM workflows</w:t>
@@ -83,12 +122,21 @@
       <w:r>
         <w:t xml:space="preserve">It enables advanced features like </w:t>
       </w:r>
-      <w:r>
-        <w:rPr>
-          <w:b/>
-          <w:bCs/>
-        </w:rPr>
-        <w:t xml:space="preserve">parallelism,loops,branching,memory and resumability, </w:t>
+      <w:proofErr w:type="spellStart"/>
+      <w:r>
+        <w:rPr>
+          <w:b/>
+          <w:bCs/>
+        </w:rPr>
+        <w:t>parallelism,loops,branching,memory</w:t>
+      </w:r>
+      <w:proofErr w:type="spellEnd"/>
+      <w:r>
+        <w:rPr>
+          <w:b/>
+          <w:bCs/>
+        </w:rPr>
+        <w:t xml:space="preserve"> and resumability, </w:t>
       </w:r>
       <w:r>
         <w:t>making it ideal for agentic and production grade ai applications</w:t>
@@ -176,7 +224,15 @@
         </w:numPr>
       </w:pPr>
       <w:r>
-        <w:t>Each step in a workflow perform a distinct task—such as prompting, reasoning, tool calling,memory access or decision-making.</w:t>
+        <w:t xml:space="preserve">Each step in a workflow perform a distinct task—such as prompting, reasoning, tool </w:t>
+      </w:r>
+      <w:proofErr w:type="spellStart"/>
+      <w:r>
+        <w:t>calling,memory</w:t>
+      </w:r>
+      <w:proofErr w:type="spellEnd"/>
+      <w:r>
+        <w:t xml:space="preserve"> access or decision-making.</w:t>
       </w:r>
     </w:p>
     <w:p>
@@ -188,7 +244,15 @@
         </w:numPr>
       </w:pPr>
       <w:r>
-        <w:t>Workflows can be linear, parallel, branched or looped,allowing for complex behaviours like retries, multi agent communication or tool-augmented reasoning</w:t>
+        <w:t xml:space="preserve">Workflows can be linear, parallel, branched or </w:t>
+      </w:r>
+      <w:proofErr w:type="spellStart"/>
+      <w:r>
+        <w:t>looped,allowing</w:t>
+      </w:r>
+      <w:proofErr w:type="spellEnd"/>
+      <w:r>
+        <w:t xml:space="preserve"> for complex behaviours like retries, multi agent communication or tool-augmented reasoning</w:t>
       </w:r>
     </w:p>
     <w:p>
@@ -442,7 +506,15 @@
     </w:p>
     <w:p>
       <w:r>
-        <w:t>In Langgraph, state is the shared memory that flows through your workflow. It holds all the data being passed between nodes as your graph runs.</w:t>
+        <w:t xml:space="preserve">In </w:t>
+      </w:r>
+      <w:proofErr w:type="spellStart"/>
+      <w:r>
+        <w:t>Langgraph</w:t>
+      </w:r>
+      <w:proofErr w:type="spellEnd"/>
+      <w:r>
+        <w:t>, state is the shared memory that flows through your workflow. It holds all the data being passed between nodes as your graph runs.</w:t>
       </w:r>
     </w:p>
     <w:p>
@@ -521,7 +593,23 @@
     </w:p>
     <w:p>
       <w:r>
-        <w:t>State is a special dictionary which we called it as TypedDict. It is a class in python. We create a object of its class and add all those fields</w:t>
+        <w:t xml:space="preserve">State is a special dictionary which we called it as </w:t>
+      </w:r>
+      <w:proofErr w:type="spellStart"/>
+      <w:r>
+        <w:t>TypedDict</w:t>
+      </w:r>
+      <w:proofErr w:type="spellEnd"/>
+      <w:r>
+        <w:t xml:space="preserve">. It is a class in python. We create </w:t>
+      </w:r>
+      <w:proofErr w:type="spellStart"/>
+      <w:r>
+        <w:t>a</w:t>
+      </w:r>
+      <w:proofErr w:type="spellEnd"/>
+      <w:r>
+        <w:t xml:space="preserve"> object of its class and add all those fields</w:t>
       </w:r>
     </w:p>
     <w:p>
@@ -557,7 +645,15 @@
     </w:p>
     <w:p>
       <w:r>
-        <w:t>Reducers in langgraph define how updates from nodes are applied to the shared state</w:t>
+        <w:t xml:space="preserve">Reducers in </w:t>
+      </w:r>
+      <w:proofErr w:type="spellStart"/>
+      <w:r>
+        <w:t>langgraph</w:t>
+      </w:r>
+      <w:proofErr w:type="spellEnd"/>
+      <w:r>
+        <w:t xml:space="preserve"> define how updates from nodes are applied to the shared state</w:t>
       </w:r>
     </w:p>
     <w:p>
@@ -570,8 +666,13 @@
       </w:r>
     </w:p>
     <w:p>
-      <w:r>
-        <w:t>Reduceres decides how to update the value of the state, either by replacing, or adding or merging</w:t>
+      <w:proofErr w:type="spellStart"/>
+      <w:r>
+        <w:t>Reduceres</w:t>
+      </w:r>
+      <w:proofErr w:type="spellEnd"/>
+      <w:r>
+        <w:t xml:space="preserve"> decides how to update the value of the state, either by replacing, or adding or merging</w:t>
       </w:r>
     </w:p>
     <w:p/>
@@ -584,6 +685,7 @@
           <w:szCs w:val="42"/>
         </w:rPr>
       </w:pPr>
+      <w:proofErr w:type="spellStart"/>
       <w:r>
         <w:rPr>
           <w:b/>
@@ -591,7 +693,17 @@
           <w:sz w:val="42"/>
           <w:szCs w:val="42"/>
         </w:rPr>
-        <w:t>Langgraph Execution model</w:t>
+        <w:t>Langgraph</w:t>
+      </w:r>
+      <w:proofErr w:type="spellEnd"/>
+      <w:r>
+        <w:rPr>
+          <w:b/>
+          <w:bCs/>
+          <w:sz w:val="42"/>
+          <w:szCs w:val="42"/>
+        </w:rPr>
+        <w:t xml:space="preserve"> Execution model</w:t>
       </w:r>
     </w:p>
     <w:p>
@@ -706,12 +818,21 @@
       <w:r>
         <w:t>You call .</w:t>
       </w:r>
-      <w:r>
-        <w:rPr>
-          <w:b/>
-          <w:bCs/>
-        </w:rPr>
-        <w:t>comile()</w:t>
+      <w:proofErr w:type="spellStart"/>
+      <w:r>
+        <w:rPr>
+          <w:b/>
+          <w:bCs/>
+        </w:rPr>
+        <w:t>comile</w:t>
+      </w:r>
+      <w:proofErr w:type="spellEnd"/>
+      <w:r>
+        <w:rPr>
+          <w:b/>
+          <w:bCs/>
+        </w:rPr>
+        <w:t>()</w:t>
       </w:r>
       <w:r>
         <w:t xml:space="preserve"> on the</w:t>
@@ -721,8 +842,17 @@
           <w:b/>
           <w:bCs/>
         </w:rPr>
-        <w:t xml:space="preserve"> Stategraph</w:t>
-      </w:r>
+        <w:t xml:space="preserve"> </w:t>
+      </w:r>
+      <w:proofErr w:type="spellStart"/>
+      <w:r>
+        <w:rPr>
+          <w:b/>
+          <w:bCs/>
+        </w:rPr>
+        <w:t>Stategraph</w:t>
+      </w:r>
+      <w:proofErr w:type="spellEnd"/>
       <w:r>
         <w:rPr>
           <w:b/>
@@ -760,8 +890,17 @@
           <w:b/>
           <w:bCs/>
         </w:rPr>
-        <w:t>invoke(initial_state)</w:t>
-      </w:r>
+        <w:t>invoke(</w:t>
+      </w:r>
+      <w:proofErr w:type="spellStart"/>
+      <w:r>
+        <w:rPr>
+          <w:b/>
+          <w:bCs/>
+        </w:rPr>
+        <w:t>initial_state</w:t>
+      </w:r>
+      <w:proofErr w:type="spellEnd"/>
       <w:r>
         <w:rPr>
           <w:b/>
@@ -769,10 +908,22 @@
         </w:rPr>
         <w:t>)</w:t>
       </w:r>
-    </w:p>
-    <w:p>
-      <w:r>
-        <w:t>Langgraph sends the initial state as a message to the entry node(s)</w:t>
+      <w:r>
+        <w:rPr>
+          <w:b/>
+          <w:bCs/>
+        </w:rPr>
+        <w:t>)</w:t>
+      </w:r>
+    </w:p>
+    <w:p>
+      <w:proofErr w:type="spellStart"/>
+      <w:r>
+        <w:t>Langgraph</w:t>
+      </w:r>
+      <w:proofErr w:type="spellEnd"/>
+      <w:r>
+        <w:t xml:space="preserve"> sends the initial state as a message to the entry node(s)</w:t>
       </w:r>
     </w:p>
     <w:p>
@@ -839,10 +990,168 @@
     <w:p/>
     <w:p/>
     <w:p>
+      <w:proofErr w:type="spellStart"/>
       <w:r>
         <w:lastRenderedPageBreak/>
-        <w:t>Pydantic is a data validation and data parsing library for python. It ensures that the data you work with is correct, structured and type-safe</w:t>
-      </w:r>
+        <w:t>Pydantic</w:t>
+      </w:r>
+      <w:proofErr w:type="spellEnd"/>
+      <w:r>
+        <w:t xml:space="preserve"> is a data validation and data parsing library for python. It ensures that the data you work with is correct, structured and type-safe</w:t>
+      </w:r>
+    </w:p>
+    <w:p/>
+    <w:p>
+      <w:r>
+        <w:rPr>
+          <w:b/>
+          <w:bCs/>
+        </w:rPr>
+        <w:t>Persistence</w:t>
+      </w:r>
+      <w:r>
+        <w:t xml:space="preserve"> in </w:t>
+      </w:r>
+      <w:proofErr w:type="spellStart"/>
+      <w:r>
+        <w:t>langraph</w:t>
+      </w:r>
+      <w:proofErr w:type="spellEnd"/>
+      <w:r>
+        <w:t xml:space="preserve"> is the ability to save and restore the state of a workflow over time</w:t>
+      </w:r>
+    </w:p>
+    <w:p>
+      <w:proofErr w:type="spellStart"/>
+      <w:r>
+        <w:t>Langgraph</w:t>
+      </w:r>
+      <w:proofErr w:type="spellEnd"/>
+      <w:r>
+        <w:t>.</w:t>
+      </w:r>
+    </w:p>
+    <w:p>
+      <w:r>
+        <w:t xml:space="preserve">Eash node represent respective task and the edges determine the </w:t>
+      </w:r>
+      <w:proofErr w:type="spellStart"/>
+      <w:r>
+        <w:t>orer</w:t>
+      </w:r>
+      <w:proofErr w:type="spellEnd"/>
+      <w:r>
+        <w:t xml:space="preserve"> of execution</w:t>
+      </w:r>
+    </w:p>
+    <w:p/>
+    <w:p>
+      <w:pPr>
+        <w:rPr>
+          <w:b/>
+          <w:bCs/>
+        </w:rPr>
+      </w:pPr>
+      <w:r>
+        <w:rPr>
+          <w:b/>
+          <w:bCs/>
+        </w:rPr>
+        <w:t>Benefits of Persistence:</w:t>
+      </w:r>
+    </w:p>
+    <w:p>
+      <w:pPr>
+        <w:pStyle w:val="ListParagraph"/>
+        <w:numPr>
+          <w:ilvl w:val="0"/>
+          <w:numId w:val="4"/>
+        </w:numPr>
+        <w:rPr>
+          <w:b/>
+          <w:bCs/>
+        </w:rPr>
+      </w:pPr>
+      <w:r>
+        <w:rPr>
+          <w:b/>
+          <w:bCs/>
+        </w:rPr>
+        <w:t>Short term memory</w:t>
+      </w:r>
+    </w:p>
+    <w:p>
+      <w:pPr>
+        <w:pStyle w:val="ListParagraph"/>
+        <w:numPr>
+          <w:ilvl w:val="0"/>
+          <w:numId w:val="4"/>
+        </w:numPr>
+        <w:rPr>
+          <w:b/>
+          <w:bCs/>
+        </w:rPr>
+      </w:pPr>
+      <w:r>
+        <w:rPr>
+          <w:b/>
+          <w:bCs/>
+        </w:rPr>
+        <w:t>Fault tolerance</w:t>
+      </w:r>
+    </w:p>
+    <w:p>
+      <w:pPr>
+        <w:pStyle w:val="ListParagraph"/>
+        <w:numPr>
+          <w:ilvl w:val="0"/>
+          <w:numId w:val="4"/>
+        </w:numPr>
+        <w:rPr>
+          <w:b/>
+          <w:bCs/>
+        </w:rPr>
+      </w:pPr>
+      <w:r>
+        <w:rPr>
+          <w:b/>
+          <w:bCs/>
+        </w:rPr>
+        <w:t>Human in the loop (HITL)</w:t>
+      </w:r>
+    </w:p>
+    <w:p>
+      <w:pPr>
+        <w:pStyle w:val="ListParagraph"/>
+        <w:numPr>
+          <w:ilvl w:val="0"/>
+          <w:numId w:val="4"/>
+        </w:numPr>
+        <w:rPr>
+          <w:b/>
+          <w:bCs/>
+        </w:rPr>
+      </w:pPr>
+      <w:r>
+        <w:rPr>
+          <w:b/>
+          <w:bCs/>
+        </w:rPr>
+        <w:t>Time travel</w:t>
+      </w:r>
+    </w:p>
+    <w:p>
+      <w:pPr>
+        <w:pStyle w:val="ListParagraph"/>
+        <w:numPr>
+          <w:ilvl w:val="0"/>
+          <w:numId w:val="4"/>
+        </w:numPr>
+        <w:rPr>
+          <w:b/>
+          <w:bCs/>
+        </w:rPr>
+      </w:pPr>
     </w:p>
     <w:p>
       <w:r>
@@ -871,6 +1180,95 @@
 <file path=word/numbering.xml><?xml version="1.0" encoding="utf-8"?>
 <w:numbering xmlns:wpc="http://schemas.microsoft.com/office/word/2010/wordprocessingCanvas" xmlns:cx="http://schemas.microsoft.com/office/drawing/2014/chartex" xmlns:cx1="http://schemas.microsoft.com/office/drawing/2015/9/8/chartex" xmlns:cx2="http://schemas.microsoft.com/office/drawing/2015/10/21/chartex" xmlns:cx3="http://schemas.microsoft.com/office/drawing/2016/5/9/chartex" xmlns:cx4="http://schemas.microsoft.com/office/drawing/2016/5/10/chartex" xmlns:cx5="http://schemas.microsoft.com/office/drawing/2016/5/11/chartex" xmlns:cx6="http://schemas.microsoft.com/office/drawing/2016/5/12/chartex" xmlns:cx7="http://schemas.microsoft.com/office/drawing/2016/5/13/chartex" xmlns:cx8="http://schemas.microsoft.com/office/drawing/2016/5/14/chartex" xmlns:mc="http://schemas.openxmlformats.org/markup-compatibility/2006" xmlns:aink="http://schemas.microsoft.com/office/drawing/2016/ink" xmlns:am3d="http://schemas.microsoft.com/office/drawing/2017/model3d" xmlns:o="urn:schemas-microsoft-com:office:office" xmlns:oel="http://schemas.microsoft.com/office/2019/extlst" xmlns:r="http://schemas.openxmlformats.org/officeDocument/2006/relationships" xmlns:m="http://schemas.openxmlformats.org/officeDocument/2006/math" xmlns:v="urn:schemas-microsoft-com:vml" xmlns:wp14="http://schemas.microsoft.com/office/word/2010/wordprocessingDrawing" xmlns:wp="http://schemas.openxmlformats.org/drawingml/2006/wordprocessingDrawing" xmlns:w10="urn:schemas-microsoft-com:office:word" xmlns:w="http://schemas.openxmlformats.org/wordprocessingml/2006/main" xmlns:w14="http://schemas.microsoft.com/office/word/2010/wordml" xmlns:w15="http://schemas.microsoft.com/office/word/2012/wordml" xmlns:w16cex="http://schemas.microsoft.com/office/word/2018/wordml/cex" xmlns:w16cid="http://schemas.microsoft.com/office/word/2016/wordml/cid" xmlns:w16="http://schemas.microsoft.com/office/word/2018/wordml" xmlns:w16du="http://schemas.microsoft.com/office/word/2023/wordml/word16du" xmlns:w16sdtdh="http://schemas.microsoft.com/office/word/2020/wordml/sdtdatahash" xmlns:w16sdtfl="http://schemas.microsoft.com/office/word/2024/wordml/sdtformatlock" xmlns:w16se="http://schemas.microsoft.com/office/word/2015/wordml/symex" xmlns:wpg="http://schemas.microsoft.com/office/word/2010/wordprocessingGroup" xmlns:wpi="http://schemas.microsoft.com/office/word/2010/wordprocessingInk" xmlns:wne="http://schemas.microsoft.com/office/word/2006/wordml" xmlns:wps="http://schemas.microsoft.com/office/word/2010/wordprocessingShape" mc:Ignorable="w14 w15 w16se w16cid w16 w16cex w16sdtdh w16sdtfl w16du wp14">
   <w:abstractNum w:abstractNumId="0" w15:restartNumberingAfterBreak="0">
+    <w:nsid w:val="27A53073"/>
+    <w:multiLevelType w:val="hybridMultilevel"/>
+    <w:tmpl w:val="829C0082"/>
+    <w:lvl w:ilvl="0" w:tplc="4009000F">
+      <w:start w:val="1"/>
+      <w:numFmt w:val="decimal"/>
+      <w:lvlText w:val="%1."/>
+      <w:lvlJc w:val="left"/>
+      <w:pPr>
+        <w:ind w:left="720" w:hanging="360"/>
+      </w:pPr>
+      <w:rPr>
+        <w:rFonts w:hint="default"/>
+      </w:rPr>
+    </w:lvl>
+    <w:lvl w:ilvl="1" w:tplc="40090019" w:tentative="1">
+      <w:start w:val="1"/>
+      <w:numFmt w:val="lowerLetter"/>
+      <w:lvlText w:val="%2."/>
+      <w:lvlJc w:val="left"/>
+      <w:pPr>
+        <w:ind w:left="1440" w:hanging="360"/>
+      </w:pPr>
+    </w:lvl>
+    <w:lvl w:ilvl="2" w:tplc="4009001B" w:tentative="1">
+      <w:start w:val="1"/>
+      <w:numFmt w:val="lowerRoman"/>
+      <w:lvlText w:val="%3."/>
+      <w:lvlJc w:val="right"/>
+      <w:pPr>
+        <w:ind w:left="2160" w:hanging="180"/>
+      </w:pPr>
+    </w:lvl>
+    <w:lvl w:ilvl="3" w:tplc="4009000F" w:tentative="1">
+      <w:start w:val="1"/>
+      <w:numFmt w:val="decimal"/>
+      <w:lvlText w:val="%4."/>
+      <w:lvlJc w:val="left"/>
+      <w:pPr>
+        <w:ind w:left="2880" w:hanging="360"/>
+      </w:pPr>
+    </w:lvl>
+    <w:lvl w:ilvl="4" w:tplc="40090019" w:tentative="1">
+      <w:start w:val="1"/>
+      <w:numFmt w:val="lowerLetter"/>
+      <w:lvlText w:val="%5."/>
+      <w:lvlJc w:val="left"/>
+      <w:pPr>
+        <w:ind w:left="3600" w:hanging="360"/>
+      </w:pPr>
+    </w:lvl>
+    <w:lvl w:ilvl="5" w:tplc="4009001B" w:tentative="1">
+      <w:start w:val="1"/>
+      <w:numFmt w:val="lowerRoman"/>
+      <w:lvlText w:val="%6."/>
+      <w:lvlJc w:val="right"/>
+      <w:pPr>
+        <w:ind w:left="4320" w:hanging="180"/>
+      </w:pPr>
+    </w:lvl>
+    <w:lvl w:ilvl="6" w:tplc="4009000F" w:tentative="1">
+      <w:start w:val="1"/>
+      <w:numFmt w:val="decimal"/>
+      <w:lvlText w:val="%7."/>
+      <w:lvlJc w:val="left"/>
+      <w:pPr>
+        <w:ind w:left="5040" w:hanging="360"/>
+      </w:pPr>
+    </w:lvl>
+    <w:lvl w:ilvl="7" w:tplc="40090019" w:tentative="1">
+      <w:start w:val="1"/>
+      <w:numFmt w:val="lowerLetter"/>
+      <w:lvlText w:val="%8."/>
+      <w:lvlJc w:val="left"/>
+      <w:pPr>
+        <w:ind w:left="5760" w:hanging="360"/>
+      </w:pPr>
+    </w:lvl>
+    <w:lvl w:ilvl="8" w:tplc="4009001B" w:tentative="1">
+      <w:start w:val="1"/>
+      <w:numFmt w:val="lowerRoman"/>
+      <w:lvlText w:val="%9."/>
+      <w:lvlJc w:val="right"/>
+      <w:pPr>
+        <w:ind w:left="6480" w:hanging="180"/>
+      </w:pPr>
+    </w:lvl>
+  </w:abstractNum>
+  <w:abstractNum w:abstractNumId="1" w15:restartNumberingAfterBreak="0">
     <w:nsid w:val="31245E45"/>
     <w:multiLevelType w:val="hybridMultilevel"/>
     <w:tmpl w:val="B33A3132"/>
@@ -983,7 +1381,7 @@
       </w:rPr>
     </w:lvl>
   </w:abstractNum>
-  <w:abstractNum w:abstractNumId="1" w15:restartNumberingAfterBreak="0">
+  <w:abstractNum w:abstractNumId="2" w15:restartNumberingAfterBreak="0">
     <w:nsid w:val="367203AA"/>
     <w:multiLevelType w:val="hybridMultilevel"/>
     <w:tmpl w:val="70E22AF2"/>
@@ -1096,7 +1494,7 @@
       </w:rPr>
     </w:lvl>
   </w:abstractNum>
-  <w:abstractNum w:abstractNumId="2" w15:restartNumberingAfterBreak="0">
+  <w:abstractNum w:abstractNumId="3" w15:restartNumberingAfterBreak="0">
     <w:nsid w:val="378F353A"/>
     <w:multiLevelType w:val="hybridMultilevel"/>
     <w:tmpl w:val="07A24D20"/>
@@ -1186,12 +1584,15 @@
     </w:lvl>
   </w:abstractNum>
   <w:num w:numId="1" w16cid:durableId="1402829131">
+    <w:abstractNumId w:val="3"/>
+  </w:num>
+  <w:num w:numId="2" w16cid:durableId="779689716">
     <w:abstractNumId w:val="2"/>
   </w:num>
-  <w:num w:numId="2" w16cid:durableId="779689716">
+  <w:num w:numId="3" w16cid:durableId="662202739">
     <w:abstractNumId w:val="1"/>
   </w:num>
-  <w:num w:numId="3" w16cid:durableId="662202739">
+  <w:num w:numId="4" w16cid:durableId="1695568792">
     <w:abstractNumId w:val="0"/>
   </w:num>
 </w:numbering>

</xml_diff>